<commit_message>
Report: update Grafana caption to match the screenshot
Co-Authored-By: Claude Opus 5.5 <noreply@anthropic.com>
</commit_message>
<xml_diff>
--- a/docs/report/report.docx
+++ b/docs/report/report.docx
@@ -9345,7 +9345,7 @@
           <wp:inline>
             <wp:extent cx="5334000" cy="4501896"/>
             <wp:effectExtent b="0" l="0" r="0" t="0"/>
-            <wp:docPr descr="Figure - Grafana dashboard on Kubernetes during a load test (two pods, 3.3k predictions, 4.9 % deliberately invalid requests)" title="" id="86" name="Picture"/>
+            <wp:docPr descr="Figure - Grafana dashboard on Kubernetes during a load test (two pods scraped, 4.6k predictions served, 4.9 % non-2xx = the deliberately invalid requests)" title="" id="86" name="Picture"/>
             <a:graphic>
               <a:graphicData uri="http://schemas.openxmlformats.org/drawingml/2006/picture">
                 <pic:pic>
@@ -9388,7 +9388,7 @@
         <w:pStyle w:val="ImageCaption"/>
       </w:pPr>
       <w:r>
-        <w:t xml:space="preserve">Figure - Grafana dashboard on Kubernetes during a load test (two pods, 3.3k predictions, 4.9 % deliberately invalid requests)</w:t>
+        <w:t xml:space="preserve">Figure - Grafana dashboard on Kubernetes during a load test (two pods scraped, 4.6k predictions served, 4.9 % non-2xx = the deliberately invalid requests)</w:t>
       </w:r>
     </w:p>
     <w:tbl>

</xml_diff>